<commit_message>
Prompt for test session: approved by owner, add audit location and public-repo note
Claude-Session: https://claude.ai/code/session_01MinGEGn6eBTPUff1swBF2k
</commit_message>
<xml_diff>
--- a/AUDIT_PACK_2026-10-18/1_Prompt_for_Other_AI.docx
+++ b/AUDIT_PACK_2026-10-18/1_Prompt_for_Other_AI.docx
@@ -2,7 +2,7 @@
 <file path=word/document.xml><?xml version="1.0" encoding="utf-8"?>
 <w:document xmlns:w="http://schemas.openxmlformats.org/wordprocessingml/2006/main" xmlns:m="http://schemas.openxmlformats.org/officeDocument/2006/math" xmlns:r="http://schemas.openxmlformats.org/officeDocument/2006/relationships" xmlns:o="urn:schemas-microsoft-com:office:office" xmlns:v="urn:schemas-microsoft-com:vml" xmlns:w10="urn:schemas-microsoft-com:office:word" xmlns:a="http://schemas.openxmlformats.org/drawingml/2006/main" xmlns:pic="http://schemas.openxmlformats.org/drawingml/2006/picture" xmlns:wp="http://schemas.openxmlformats.org/drawingml/2006/wordprocessingDrawing">
   <w:body>
-    <w:bookmarkStart w:id="28" w:name="X51fefb01cec89ccb6ed131aebdfa629f2ab4233"/>
+    <w:bookmarkStart w:id="29" w:name="X51fefb01cec89ccb6ed131aebdfa629f2ab4233"/>
     <w:p>
       <w:pPr>
         <w:pStyle w:val="Heading1"/>
@@ -71,7 +71,7 @@
         <w:t xml:space="preserve"> </w:t>
       </w:r>
       <w:r>
-        <w:t xml:space="preserve">DRAFT. The owner reviews and edits this before it is sent. Nothing has been sent.</w:t>
+        <w:t xml:space="preserve">Approved by the owner and sent to the session running the tests on 18 Oct 2026.</w:t>
       </w:r>
     </w:p>
     <w:p>
@@ -81,7 +81,7 @@
         </w:pict>
       </w:r>
     </w:p>
-    <w:bookmarkStart w:id="26" w:name="the-prompt"/>
+    <w:bookmarkStart w:id="27" w:name="the-prompt"/>
     <w:p>
       <w:pPr>
         <w:pStyle w:val="Heading2"/>
@@ -945,7 +945,161 @@
         <w:pStyle w:val="Compact"/>
       </w:pPr>
       <w:r>
+        <w:t xml:space="preserve">Bring my standing rules onto the research branch:</w:t>
+      </w:r>
+      <w:r>
+        <w:t xml:space="preserve"> </w:t>
+      </w:r>
+      <w:r>
+        <w:rPr>
+          <w:rStyle w:val="VerbatimChar"/>
+        </w:rPr>
+        <w:t xml:space="preserve">git checkout origin/ccr-1be0d913-audit-pack -- CLAUDE.md</w:t>
+      </w:r>
+      <w:r>
+        <w:t xml:space="preserve">, then commit and push.</w:t>
+      </w:r>
+    </w:p>
+    <w:p>
+      <w:pPr>
+        <w:numPr>
+          <w:ilvl w:val="0"/>
+          <w:numId w:val="1006"/>
+        </w:numPr>
+        <w:pStyle w:val="Compact"/>
+      </w:pPr>
+      <w:r>
         <w:t xml:space="preserve">Stop. Do not start a new experiment. The next step is a conversation test (does carried state help a model stay true to what a person said early in a long conversation?). I will approve its pass/fail rules first.</w:t>
+      </w:r>
+    </w:p>
+    <w:bookmarkEnd w:id="25"/>
+    <w:bookmarkStart w:id="26" w:name="where-the-audit-is-and-one-correction"/>
+    <w:p>
+      <w:pPr>
+        <w:pStyle w:val="Heading3"/>
+      </w:pPr>
+      <w:r>
+        <w:t xml:space="preserve">7. Where the audit is, and one correction</w:t>
+      </w:r>
+    </w:p>
+    <w:p>
+      <w:pPr>
+        <w:numPr>
+          <w:ilvl w:val="0"/>
+          <w:numId w:val="1007"/>
+        </w:numPr>
+        <w:pStyle w:val="Compact"/>
+      </w:pPr>
+      <w:r>
+        <w:rPr>
+          <w:bCs/>
+          <w:b/>
+        </w:rPr>
+        <w:t xml:space="preserve">Audit folder:</w:t>
+      </w:r>
+      <w:r>
+        <w:t xml:space="preserve"> </w:t>
+      </w:r>
+      <w:r>
+        <w:t xml:space="preserve">branch</w:t>
+      </w:r>
+      <w:r>
+        <w:t xml:space="preserve"> </w:t>
+      </w:r>
+      <w:r>
+        <w:rPr>
+          <w:rStyle w:val="VerbatimChar"/>
+        </w:rPr>
+        <w:t xml:space="preserve">ccr-1be0d913-audit-pack</w:t>
+      </w:r>
+      <w:r>
+        <w:t xml:space="preserve">, folder</w:t>
+      </w:r>
+      <w:r>
+        <w:t xml:space="preserve"> </w:t>
+      </w:r>
+      <w:r>
+        <w:rPr>
+          <w:rStyle w:val="VerbatimChar"/>
+        </w:rPr>
+        <w:t xml:space="preserve">AUDIT_PACK_2026-10-18/</w:t>
+      </w:r>
+      <w:r>
+        <w:t xml:space="preserve">. Start with</w:t>
+      </w:r>
+      <w:r>
+        <w:t xml:space="preserve"> </w:t>
+      </w:r>
+      <w:r>
+        <w:rPr>
+          <w:rStyle w:val="VerbatimChar"/>
+        </w:rPr>
+        <w:t xml:space="preserve">00_START_HERE_Master_Audit.docx</w:t>
+      </w:r>
+      <w:r>
+        <w:t xml:space="preserve">. It has the timeline, every problem with its commit code, and a script (</w:t>
+      </w:r>
+      <w:r>
+        <w:rPr>
+          <w:rStyle w:val="VerbatimChar"/>
+        </w:rPr>
+        <w:t xml:space="preserve">6_Number_Check/check_numbers.py</w:t>
+      </w:r>
+      <w:r>
+        <w:t xml:space="preserve">) that recomputes the headline numbers from the raw files.</w:t>
+      </w:r>
+    </w:p>
+    <w:p>
+      <w:pPr>
+        <w:numPr>
+          <w:ilvl w:val="0"/>
+          <w:numId w:val="1007"/>
+        </w:numPr>
+        <w:pStyle w:val="Compact"/>
+      </w:pPr>
+      <w:r>
+        <w:rPr>
+          <w:bCs/>
+          <w:b/>
+        </w:rPr>
+        <w:t xml:space="preserve">My standing rules:</w:t>
+      </w:r>
+      <w:r>
+        <w:t xml:space="preserve"> </w:t>
+      </w:r>
+      <w:r>
+        <w:rPr>
+          <w:rStyle w:val="VerbatimChar"/>
+        </w:rPr>
+        <w:t xml:space="preserve">CLAUDE.md</w:t>
+      </w:r>
+      <w:r>
+        <w:t xml:space="preserve"> </w:t>
+      </w:r>
+      <w:r>
+        <w:t xml:space="preserve">at the top of that branch. Follow them from now on.</w:t>
+      </w:r>
+    </w:p>
+    <w:p>
+      <w:pPr>
+        <w:numPr>
+          <w:ilvl w:val="0"/>
+          <w:numId w:val="1007"/>
+        </w:numPr>
+        <w:pStyle w:val="Compact"/>
+      </w:pPr>
+      <w:r>
+        <w:rPr>
+          <w:bCs/>
+          <w:b/>
+        </w:rPr>
+        <w:t xml:space="preserve">The repository is PUBLIC (MIT license).</w:t>
+      </w:r>
+      <w:r>
+        <w:t xml:space="preserve"> </w:t>
+      </w:r>
+      <w:r>
+        <w:t xml:space="preserve">Anyone can read everything pushed. Don’t describe it as private, and don’t push anything personal beyond what I ask for.</w:t>
       </w:r>
     </w:p>
     <w:p>
@@ -955,9 +1109,9 @@
         </w:pict>
       </w:r>
     </w:p>
-    <w:bookmarkEnd w:id="25"/>
     <w:bookmarkEnd w:id="26"/>
-    <w:bookmarkStart w:id="27" w:name="X788b81380bd0e4f91df532585d78c28b4b99165"/>
+    <w:bookmarkEnd w:id="27"/>
+    <w:bookmarkStart w:id="28" w:name="X788b81380bd0e4f91df532585d78c28b4b99165"/>
     <w:p>
       <w:pPr>
         <w:pStyle w:val="Heading2"/>
@@ -970,7 +1124,7 @@
       <w:pPr>
         <w:numPr>
           <w:ilvl w:val="0"/>
-          <w:numId w:val="1007"/>
+          <w:numId w:val="1008"/>
         </w:numPr>
         <w:pStyle w:val="Compact"/>
       </w:pPr>
@@ -1022,7 +1176,7 @@
       <w:pPr>
         <w:numPr>
           <w:ilvl w:val="0"/>
-          <w:numId w:val="1007"/>
+          <w:numId w:val="1008"/>
         </w:numPr>
         <w:pStyle w:val="Compact"/>
       </w:pPr>
@@ -1044,7 +1198,7 @@
       <w:pPr>
         <w:numPr>
           <w:ilvl w:val="0"/>
-          <w:numId w:val="1007"/>
+          <w:numId w:val="1008"/>
         </w:numPr>
         <w:pStyle w:val="Compact"/>
       </w:pPr>
@@ -1062,8 +1216,8 @@
         <w:t xml:space="preserve">I can’t place files on your laptop desktop or phone home screen. I can send real files to the app, where you tap to save them.</w:t>
       </w:r>
     </w:p>
-    <w:bookmarkEnd w:id="27"/>
     <w:bookmarkEnd w:id="28"/>
+    <w:bookmarkEnd w:id="29"/>
     <w:sectPr/>
   </w:body>
 </w:document>
@@ -1407,6 +1561,9 @@
     </w:lvlOverride>
   </w:num>
   <w:num w:numId="1007">
+    <w:abstractNumId w:val="991"/>
+  </w:num>
+  <w:num w:numId="1008">
     <w:abstractNumId w:val="991"/>
   </w:num>
 </w:numbering>

</xml_diff>